<commit_message>
Membrete: asunto y micro índice en la primera página
Co-Authored-By: Claude Opus 5.5 <noreply@anthropic.com>
Claude-Session: https://claude.ai/code/session_01NeHkYtKpNTVMo5tPgtXgnp
</commit_message>
<xml_diff>
--- a/marca/membrete/membrete-ENTRE-TODOS.docx
+++ b/marca/membrete/membrete-ENTRE-TODOS.docx
@@ -4,73 +4,371 @@
   <w:body>
     <w:p>
       <w:pPr>
-        <w:spacing w:after="360"/>
-        <w:jc w:val="right"/>
-      </w:pPr>
-      <w:r>
-        <w:rPr>
-          <w:rFonts w:ascii="Barlow" w:cs="Barlow" w:eastAsia="Barlow" w:hAnsi="Barlow"/>
-          <w:color w:val="5F6B80"/>
-        </w:rPr>
-        <w:t xml:space="preserve">Potsdam, [día] de [mes] de 2026</w:t>
-      </w:r>
-    </w:p>
-    <w:p>
-      <w:pPr>
-        <w:spacing w:after="0"/>
+        <w:spacing w:after="120"/>
       </w:pPr>
       <w:r>
         <w:rPr>
           <w:rFonts w:ascii="Barlow" w:cs="Barlow" w:eastAsia="Barlow" w:hAnsi="Barlow"/>
           <w:b/>
           <w:bCs/>
-        </w:rPr>
-        <w:t xml:space="preserve">[Nombre del destinatario]</w:t>
-      </w:r>
-    </w:p>
-    <w:p>
-      <w:pPr>
-        <w:spacing w:after="0"/>
-      </w:pPr>
-      <w:r>
-        <w:rPr>
-          <w:rFonts w:ascii="Barlow" w:cs="Barlow" w:eastAsia="Barlow" w:hAnsi="Barlow"/>
-        </w:rPr>
-        <w:t xml:space="preserve">[Cargo, organización]</w:t>
-      </w:r>
-    </w:p>
-    <w:p>
-      <w:pPr>
-        <w:spacing w:after="360"/>
-      </w:pPr>
-      <w:r>
-        <w:rPr>
-          <w:rFonts w:ascii="Barlow" w:cs="Barlow" w:eastAsia="Barlow" w:hAnsi="Barlow"/>
-        </w:rPr>
-        <w:t xml:space="preserve">[Dirección o correo]</w:t>
-      </w:r>
-    </w:p>
-    <w:p>
-      <w:pPr>
-        <w:spacing w:after="360"/>
-      </w:pPr>
-      <w:r>
-        <w:rPr>
-          <w:rFonts w:ascii="Barlow" w:cs="Barlow" w:eastAsia="Barlow" w:hAnsi="Barlow"/>
+          <w:color w:val="D7192D"/>
+          <w:spacing w:val="12"/>
+          <w:sz w:val="16"/>
+          <w:szCs w:val="16"/>
+        </w:rPr>
+        <w:t xml:space="preserve">DOCUMENTO OFICIAL  ·  [TIPO: ACUERDO / CARTA / INFORME / ACTA]</w:t>
+      </w:r>
+    </w:p>
+    <w:p>
+      <w:pPr>
+        <w:spacing w:after="220" w:before="0" w:line="276" w:lineRule="auto"/>
+      </w:pPr>
+      <w:r>
+        <w:rPr>
+          <w:rFonts w:ascii="Barlow Condensed" w:cs="Barlow Condensed" w:eastAsia="Barlow Condensed" w:hAnsi="Barlow Condensed"/>
           <w:b/>
           <w:bCs/>
           <w:color w:val="0B1D3F"/>
-        </w:rPr>
-        <w:t xml:space="preserve">Asunto: </w:t>
-      </w:r>
+          <w:sz w:val="40"/>
+          <w:szCs w:val="40"/>
+        </w:rPr>
+        <w:t xml:space="preserve">[ASUNTO DEL DOCUMENTO EN UNA LÍNEA]</w:t>
+      </w:r>
+    </w:p>
+    <w:tbl>
+      <w:tblPr>
+        <w:tblW w:type="dxa" w:w="9639"/>
+        <w:tblBorders>
+          <w:top w:val="none" w:color="FFFFFF" w:sz="0"/>
+          <w:left w:val="single" w:color="0B1D3F" w:sz="36"/>
+          <w:bottom w:val="none" w:color="FFFFFF" w:sz="0"/>
+          <w:right w:val="none" w:color="FFFFFF" w:sz="0"/>
+          <w:insideH w:val="none" w:color="FFFFFF" w:sz="0"/>
+          <w:insideV w:val="single" w:color="FFFFFF" w:sz="4"/>
+        </w:tblBorders>
+      </w:tblPr>
+      <w:tblGrid>
+        <w:gridCol w:w="6124"/>
+        <w:gridCol w:w="3515"/>
+      </w:tblGrid>
+      <w:tr>
+        <w:tc>
+          <w:tcPr>
+            <w:tcW w:type="dxa" w:w="6124"/>
+            <w:shd w:fill="E8EDF7" w:color="auto" w:val="clear"/>
+            <w:tcMar>
+              <w:top w:type="dxa" w:w="160"/>
+              <w:left w:type="dxa" w:w="240"/>
+              <w:bottom w:type="dxa" w:w="160"/>
+              <w:right w:type="dxa" w:w="200"/>
+            </w:tcMar>
+          </w:tcPr>
+          <w:p>
+            <w:pPr>
+              <w:spacing w:after="80"/>
+            </w:pPr>
+            <w:r>
+              <w:rPr>
+                <w:rFonts w:ascii="Barlow" w:cs="Barlow" w:eastAsia="Barlow" w:hAnsi="Barlow"/>
+                <w:b/>
+                <w:bCs/>
+                <w:color w:val="D7192D"/>
+                <w:spacing w:val="10"/>
+                <w:sz w:val="15"/>
+                <w:szCs w:val="15"/>
+              </w:rPr>
+              <w:t xml:space="preserve">CONTENIDO</w:t>
+            </w:r>
+          </w:p>
+          <w:p>
+            <w:pPr>
+              <w:spacing w:after="40" w:line="260"/>
+            </w:pPr>
+            <w:r>
+              <w:rPr>
+                <w:rFonts w:ascii="Barlow" w:cs="Barlow" w:eastAsia="Barlow" w:hAnsi="Barlow"/>
+                <w:b/>
+                <w:bCs/>
+                <w:color w:val="0B1D3F"/>
+                <w:sz w:val="19"/>
+                <w:szCs w:val="19"/>
+              </w:rPr>
+              <w:t xml:space="preserve">1  </w:t>
+            </w:r>
+            <w:r>
+              <w:rPr>
+                <w:rFonts w:ascii="Barlow" w:cs="Barlow" w:eastAsia="Barlow" w:hAnsi="Barlow"/>
+                <w:color w:val="0B1630"/>
+                <w:sz w:val="19"/>
+                <w:szCs w:val="19"/>
+              </w:rPr>
+              <w:t xml:space="preserve">[Primer apartado]</w:t>
+            </w:r>
+          </w:p>
+          <w:p>
+            <w:pPr>
+              <w:spacing w:after="40" w:line="260"/>
+            </w:pPr>
+            <w:r>
+              <w:rPr>
+                <w:rFonts w:ascii="Barlow" w:cs="Barlow" w:eastAsia="Barlow" w:hAnsi="Barlow"/>
+                <w:b/>
+                <w:bCs/>
+                <w:color w:val="0B1D3F"/>
+                <w:sz w:val="19"/>
+                <w:szCs w:val="19"/>
+              </w:rPr>
+              <w:t xml:space="preserve">2  </w:t>
+            </w:r>
+            <w:r>
+              <w:rPr>
+                <w:rFonts w:ascii="Barlow" w:cs="Barlow" w:eastAsia="Barlow" w:hAnsi="Barlow"/>
+                <w:color w:val="0B1630"/>
+                <w:sz w:val="19"/>
+                <w:szCs w:val="19"/>
+              </w:rPr>
+              <w:t xml:space="preserve">[Segundo apartado]</w:t>
+            </w:r>
+          </w:p>
+          <w:p>
+            <w:pPr>
+              <w:spacing w:after="40" w:line="260"/>
+            </w:pPr>
+            <w:r>
+              <w:rPr>
+                <w:rFonts w:ascii="Barlow" w:cs="Barlow" w:eastAsia="Barlow" w:hAnsi="Barlow"/>
+                <w:b/>
+                <w:bCs/>
+                <w:color w:val="0B1D3F"/>
+                <w:sz w:val="19"/>
+                <w:szCs w:val="19"/>
+              </w:rPr>
+              <w:t xml:space="preserve">3  </w:t>
+            </w:r>
+            <w:r>
+              <w:rPr>
+                <w:rFonts w:ascii="Barlow" w:cs="Barlow" w:eastAsia="Barlow" w:hAnsi="Barlow"/>
+                <w:color w:val="0B1630"/>
+                <w:sz w:val="19"/>
+                <w:szCs w:val="19"/>
+              </w:rPr>
+              <w:t xml:space="preserve">[Tercer apartado]</w:t>
+            </w:r>
+          </w:p>
+          <w:p>
+            <w:pPr>
+              <w:spacing w:after="40" w:line="260"/>
+            </w:pPr>
+            <w:r>
+              <w:rPr>
+                <w:rFonts w:ascii="Barlow" w:cs="Barlow" w:eastAsia="Barlow" w:hAnsi="Barlow"/>
+                <w:b/>
+                <w:bCs/>
+                <w:color w:val="0B1D3F"/>
+                <w:sz w:val="19"/>
+                <w:szCs w:val="19"/>
+              </w:rPr>
+              <w:t xml:space="preserve">4  </w:t>
+            </w:r>
+            <w:r>
+              <w:rPr>
+                <w:rFonts w:ascii="Barlow" w:cs="Barlow" w:eastAsia="Barlow" w:hAnsi="Barlow"/>
+                <w:color w:val="0B1630"/>
+                <w:sz w:val="19"/>
+                <w:szCs w:val="19"/>
+              </w:rPr>
+              <w:t xml:space="preserve">[Anexos]</w:t>
+            </w:r>
+          </w:p>
+        </w:tc>
+        <w:tc>
+          <w:tcPr>
+            <w:tcW w:type="dxa" w:w="3515"/>
+            <w:shd w:fill="E8EDF7" w:color="auto" w:val="clear"/>
+            <w:tcMar>
+              <w:top w:type="dxa" w:w="160"/>
+              <w:left w:type="dxa" w:w="200"/>
+              <w:bottom w:type="dxa" w:w="160"/>
+              <w:right w:type="dxa" w:w="200"/>
+            </w:tcMar>
+          </w:tcPr>
+          <w:p>
+            <w:pPr>
+              <w:spacing w:after="80"/>
+            </w:pPr>
+            <w:r>
+              <w:rPr>
+                <w:rFonts w:ascii="Barlow" w:cs="Barlow" w:eastAsia="Barlow" w:hAnsi="Barlow"/>
+                <w:b/>
+                <w:bCs/>
+                <w:color w:val="D7192D"/>
+                <w:spacing w:val="10"/>
+                <w:sz w:val="15"/>
+                <w:szCs w:val="15"/>
+              </w:rPr>
+              <w:t xml:space="preserve">FICHA</w:t>
+            </w:r>
+          </w:p>
+          <w:p>
+            <w:pPr>
+              <w:spacing w:after="40" w:line="260"/>
+            </w:pPr>
+            <w:r>
+              <w:rPr>
+                <w:rFonts w:ascii="Barlow" w:cs="Barlow" w:eastAsia="Barlow" w:hAnsi="Barlow"/>
+                <w:b/>
+                <w:bCs/>
+                <w:color w:val="0B1D3F"/>
+                <w:sz w:val="17"/>
+                <w:szCs w:val="17"/>
+              </w:rPr>
+              <w:t xml:space="preserve">Ref.  </w:t>
+            </w:r>
+            <w:r>
+              <w:rPr>
+                <w:rFonts w:ascii="Barlow" w:cs="Barlow" w:eastAsia="Barlow" w:hAnsi="Barlow"/>
+                <w:color w:val="3A4458"/>
+                <w:sz w:val="17"/>
+                <w:szCs w:val="17"/>
+              </w:rPr>
+              <w:t xml:space="preserve">ET-2026-[000]</w:t>
+            </w:r>
+          </w:p>
+          <w:p>
+            <w:pPr>
+              <w:spacing w:after="40" w:line="260"/>
+            </w:pPr>
+            <w:r>
+              <w:rPr>
+                <w:rFonts w:ascii="Barlow" w:cs="Barlow" w:eastAsia="Barlow" w:hAnsi="Barlow"/>
+                <w:b/>
+                <w:bCs/>
+                <w:color w:val="0B1D3F"/>
+                <w:sz w:val="17"/>
+                <w:szCs w:val="17"/>
+              </w:rPr>
+              <w:t xml:space="preserve">Fecha  </w:t>
+            </w:r>
+            <w:r>
+              <w:rPr>
+                <w:rFonts w:ascii="Barlow" w:cs="Barlow" w:eastAsia="Barlow" w:hAnsi="Barlow"/>
+                <w:color w:val="3A4458"/>
+                <w:sz w:val="17"/>
+                <w:szCs w:val="17"/>
+              </w:rPr>
+              <w:t xml:space="preserve">[dd/mm/2026]</w:t>
+            </w:r>
+          </w:p>
+          <w:p>
+            <w:pPr>
+              <w:spacing w:after="40" w:line="260"/>
+            </w:pPr>
+            <w:r>
+              <w:rPr>
+                <w:rFonts w:ascii="Barlow" w:cs="Barlow" w:eastAsia="Barlow" w:hAnsi="Barlow"/>
+                <w:b/>
+                <w:bCs/>
+                <w:color w:val="0B1D3F"/>
+                <w:sz w:val="17"/>
+                <w:szCs w:val="17"/>
+              </w:rPr>
+              <w:t xml:space="preserve">Para  </w:t>
+            </w:r>
+            <w:r>
+              <w:rPr>
+                <w:rFonts w:ascii="Barlow" w:cs="Barlow" w:eastAsia="Barlow" w:hAnsi="Barlow"/>
+                <w:color w:val="3A4458"/>
+                <w:sz w:val="17"/>
+                <w:szCs w:val="17"/>
+              </w:rPr>
+              <w:t xml:space="preserve">[destinatario]</w:t>
+            </w:r>
+          </w:p>
+          <w:p>
+            <w:pPr>
+              <w:spacing w:after="40" w:line="260"/>
+            </w:pPr>
+            <w:r>
+              <w:rPr>
+                <w:rFonts w:ascii="Barlow" w:cs="Barlow" w:eastAsia="Barlow" w:hAnsi="Barlow"/>
+                <w:b/>
+                <w:bCs/>
+                <w:color w:val="0B1D3F"/>
+                <w:sz w:val="17"/>
+                <w:szCs w:val="17"/>
+              </w:rPr>
+              <w:t xml:space="preserve">Estado  </w:t>
+            </w:r>
+            <w:r>
+              <w:rPr>
+                <w:rFonts w:ascii="Barlow" w:cs="Barlow" w:eastAsia="Barlow" w:hAnsi="Barlow"/>
+                <w:color w:val="3A4458"/>
+                <w:sz w:val="17"/>
+                <w:szCs w:val="17"/>
+              </w:rPr>
+              <w:t xml:space="preserve">[Borrador / Firmado]</w:t>
+            </w:r>
+          </w:p>
+        </w:tc>
+      </w:tr>
+    </w:tbl>
+    <w:p>
+      <w:pPr>
+        <w:spacing w:after="200"/>
+      </w:pPr>
+      <w:r>
+        <w:rPr>
+          <w:rFonts w:ascii="Barlow" w:cs="Barlow" w:eastAsia="Barlow" w:hAnsi="Barlow"/>
+        </w:rPr>
+        <w:t xml:space="preserve"/>
+      </w:r>
+    </w:p>
+    <w:p>
+      <w:pPr>
+        <w:spacing w:after="240"/>
+        <w:jc w:val="right"/>
+      </w:pPr>
+      <w:r>
+        <w:rPr>
+          <w:rFonts w:ascii="Barlow" w:cs="Barlow" w:eastAsia="Barlow" w:hAnsi="Barlow"/>
+          <w:color w:val="5F6B80"/>
+        </w:rPr>
+        <w:t xml:space="preserve">Potsdam, [día] de [mes] de 2026</w:t>
+      </w:r>
+    </w:p>
+    <w:p>
+      <w:pPr>
+        <w:spacing w:after="0"/>
+      </w:pPr>
       <w:r>
         <w:rPr>
           <w:rFonts w:ascii="Barlow" w:cs="Barlow" w:eastAsia="Barlow" w:hAnsi="Barlow"/>
           <w:b/>
           <w:bCs/>
-          <w:color w:val="0B1D3F"/>
-        </w:rPr>
-        <w:t xml:space="preserve">[asunto del documento]</w:t>
+        </w:rPr>
+        <w:t xml:space="preserve">[Nombre del destinatario]</w:t>
+      </w:r>
+    </w:p>
+    <w:p>
+      <w:pPr>
+        <w:spacing w:after="0"/>
+      </w:pPr>
+      <w:r>
+        <w:rPr>
+          <w:rFonts w:ascii="Barlow" w:cs="Barlow" w:eastAsia="Barlow" w:hAnsi="Barlow"/>
+        </w:rPr>
+        <w:t xml:space="preserve">[Cargo, organización]</w:t>
+      </w:r>
+    </w:p>
+    <w:p>
+      <w:pPr>
+        <w:spacing w:after="300"/>
+      </w:pPr>
+      <w:r>
+        <w:rPr>
+          <w:rFonts w:ascii="Barlow" w:cs="Barlow" w:eastAsia="Barlow" w:hAnsi="Barlow"/>
+        </w:rPr>
+        <w:t xml:space="preserve">[Dirección o correo]</w:t>
       </w:r>
     </w:p>
     <w:p>

</xml_diff>